<commit_message>
update local ai feature
</commit_message>
<xml_diff>
--- a/docs/05_GenAI_SoftwareDevelopment_functional-testing.docx
+++ b/docs/05_GenAI_SoftwareDevelopment_functional-testing.docx
@@ -7082,6 +7082,219 @@
           </w:p>
         </w:tc>
       </w:tr>
+      <w:tr>
+        <w:tc>
+          <w:tcPr>
+            <w:tcW w:w="2482" w:type="dxa"/>
+            <w:tcMar>
+              <w:top w:w="120" w:type="dxa"/>
+              <w:left w:w="180" w:type="dxa"/>
+              <w:bottom w:w="120" w:type="dxa"/>
+              <w:right w:w="180" w:type="dxa"/>
+            </w:tcMar>
+            <w:vAlign w:val="center"/>
+          </w:tcPr>
+          <w:p>
+            <w:pPr>
+              <w:spacing w:after="120" w:line="240" w:lineRule="auto"/>
+              <w:rPr>
+                <w:rFonts w:ascii="Times New Roman" w:hAnsi="Times New Roman" w:cs="Times New Roman"/>
+                <w:b/>
+                <w:bCs/>
+                <w:sz w:val="26"/>
+                <w:szCs w:val="26"/>
+              </w:rPr>
+            </w:pPr>
+            <w:r>
+              <w:rPr>
+                <w:rFonts w:ascii="Times New Roman" w:hAnsi="Times New Roman" w:cs="Times New Roman"/>
+                <w:b/>
+                <w:bCs/>
+                <w:sz w:val="26"/>
+                <w:szCs w:val="26"/>
+              </w:rPr>
+              <w:t>TC_AI_LOCAL_01</w:t>
+            </w:r>
+          </w:p>
+        </w:tc>
+        <w:tc>
+          <w:tcPr>
+            <w:tcW w:w="1879" w:type="dxa"/>
+            <w:tcMar>
+              <w:top w:w="120" w:type="dxa"/>
+              <w:left w:w="180" w:type="dxa"/>
+              <w:bottom w:w="120" w:type="dxa"/>
+              <w:right w:w="180" w:type="dxa"/>
+            </w:tcMar>
+            <w:vAlign w:val="center"/>
+          </w:tcPr>
+          <w:p>
+            <w:pPr>
+              <w:spacing w:after="120" w:line="240" w:lineRule="auto"/>
+              <w:rPr>
+                <w:rFonts w:ascii="Times New Roman" w:hAnsi="Times New Roman" w:cs="Times New Roman"/>
+                <w:sz w:val="26"/>
+                <w:szCs w:val="26"/>
+              </w:rPr>
+            </w:pPr>
+            <w:r>
+              <w:rPr>
+                <w:rFonts w:ascii="Times New Roman" w:hAnsi="Times New Roman" w:cs="Times New Roman"/>
+                <w:sz w:val="26"/>
+                <w:szCs w:val="26"/>
+              </w:rPr>
+              <w:t>AI Bảo mật nội bộ (NFR8</w:t>
+            </w:r>
+            <w:r>
+              <w:rPr>
+                <w:rFonts w:ascii="Times New Roman" w:hAnsi="Times New Roman" w:cs="Times New Roman"/>
+                <w:sz w:val="26"/>
+                <w:szCs w:val="26"/>
+              </w:rPr>
+              <w:t>)</w:t>
+            </w:r>
+          </w:p>
+        </w:tc>
+        <w:tc>
+          <w:tcPr>
+            <w:tcW w:w="3122" w:type="dxa"/>
+            <w:tcMar>
+              <w:top w:w="120" w:type="dxa"/>
+              <w:left w:w="180" w:type="dxa"/>
+              <w:bottom w:w="120" w:type="dxa"/>
+              <w:right w:w="180" w:type="dxa"/>
+            </w:tcMar>
+            <w:vAlign w:val="center"/>
+          </w:tcPr>
+          <w:p>
+            <w:pPr>
+              <w:spacing w:after="120" w:line="240" w:lineRule="auto"/>
+              <w:rPr>
+                <w:rFonts w:ascii="Times New Roman" w:hAnsi="Times New Roman" w:cs="Times New Roman"/>
+                <w:sz w:val="26"/>
+                <w:szCs w:val="26"/>
+              </w:rPr>
+            </w:pPr>
+            <w:r>
+              <w:rPr>
+                <w:rFonts w:ascii="Times New Roman" w:hAnsi="Times New Roman" w:cs="Times New Roman"/>
+                <w:sz w:val="26"/>
+                <w:szCs w:val="26"/>
+              </w:rPr>
+              <w:t>Kiểm tra cơ chế tự động định tuyến AI Cục bộ cho công văn lưu hành nội bộ, bảo mật dữ liệu tuyệt đối không gửi ra Cloud bên ngoài</w:t>
+            </w:r>
+          </w:p>
+        </w:tc>
+        <w:tc>
+          <w:tcPr>
+            <w:tcW w:w="2406" w:type="dxa"/>
+            <w:tcMar>
+              <w:top w:w="120" w:type="dxa"/>
+              <w:left w:w="180" w:type="dxa"/>
+              <w:bottom w:w="120" w:type="dxa"/>
+              <w:right w:w="180" w:type="dxa"/>
+            </w:tcMar>
+            <w:vAlign w:val="center"/>
+          </w:tcPr>
+          <w:p>
+            <w:pPr>
+              <w:spacing w:after="120" w:line="240" w:lineRule="auto"/>
+              <w:rPr>
+                <w:rFonts w:ascii="Times New Roman" w:hAnsi="Times New Roman" w:cs="Times New Roman"/>
+                <w:sz w:val="26"/>
+                <w:szCs w:val="26"/>
+              </w:rPr>
+            </w:pPr>
+            <w:r>
+              <w:rPr>
+                <w:rFonts w:ascii="Times New Roman" w:hAnsi="Times New Roman" w:cs="Times New Roman"/>
+                <w:sz w:val="26"/>
+                <w:szCs w:val="26"/>
+              </w:rPr>
+              <w:t>Người dùng đã đăng nhập hệ thống, mở văn bản có phạm vi nội bộ</w:t>
+            </w:r>
+          </w:p>
+        </w:tc>
+        <w:tc>
+          <w:tcPr>
+            <w:tcW w:w="3265" w:type="dxa"/>
+            <w:tcMar>
+              <w:top w:w="120" w:type="dxa"/>
+              <w:left w:w="180" w:type="dxa"/>
+              <w:bottom w:w="120" w:type="dxa"/>
+              <w:right w:w="180" w:type="dxa"/>
+            </w:tcMar>
+            <w:vAlign w:val="center"/>
+          </w:tcPr>
+          <w:p>
+            <w:pPr>
+              <w:spacing w:after="120" w:line="240" w:lineRule="auto"/>
+              <w:rPr>
+                <w:rFonts w:ascii="Times New Roman" w:hAnsi="Times New Roman" w:cs="Times New Roman"/>
+                <w:sz w:val="26"/>
+                <w:szCs w:val="26"/>
+              </w:rPr>
+            </w:pPr>
+            <w:r>
+              <w:rPr>
+                <w:rFonts w:ascii="Times New Roman" w:hAnsi="Times New Roman" w:cs="Times New Roman"/>
+                <w:sz w:val="26"/>
+                <w:szCs w:val="26"/>
+              </w:rPr>
+              <w:t>Công văn có document_scope = "INTERNAL" hoặc trích yếu có từ khóa: </w:t>
+            </w:r>
+            <w:r>
+              <w:rPr>
+                <w:rFonts w:ascii="Times New Roman" w:hAnsi="Times New Roman" w:cs="Times New Roman"/>
+                <w:i/>
+                <w:iCs/>
+                <w:sz w:val="26"/>
+                <w:szCs w:val="26"/>
+              </w:rPr>
+              <w:t>"Thông báo lưu hành nội bộ về đánh giá thi đua và dự toán Quý 2"</w:t>
+            </w:r>
+          </w:p>
+        </w:tc>
+        <w:tc>
+          <w:tcPr>
+            <w:tcW w:w="3839" w:type="dxa"/>
+            <w:tcMar>
+              <w:top w:w="120" w:type="dxa"/>
+              <w:left w:w="180" w:type="dxa"/>
+              <w:bottom w:w="120" w:type="dxa"/>
+              <w:right w:w="180" w:type="dxa"/>
+            </w:tcMar>
+            <w:vAlign w:val="center"/>
+          </w:tcPr>
+          <w:p>
+            <w:pPr>
+              <w:spacing w:after="120" w:line="240" w:lineRule="auto"/>
+              <w:rPr>
+                <w:rFonts w:ascii="Times New Roman" w:hAnsi="Times New Roman" w:cs="Times New Roman"/>
+                <w:sz w:val="26"/>
+                <w:szCs w:val="26"/>
+              </w:rPr>
+            </w:pPr>
+            <w:r>
+              <w:rPr>
+                <w:rFonts w:ascii="Times New Roman" w:hAnsi="Times New Roman" w:cs="Times New Roman"/>
+                <w:sz w:val="26"/>
+                <w:szCs w:val="26"/>
+              </w:rPr>
+              <w:t>AI bóc tách, tóm tắt và sinh dự thảo thành công qua Local Engine (không gửi dữ liệu ra ngoài Internet).</w:t>
+            </w:r>
+            <w:r>
+              <w:rPr>
+                <w:rFonts w:ascii="Times New Roman" w:hAnsi="Times New Roman" w:cs="Times New Roman"/>
+                <w:sz w:val="26"/>
+                <w:szCs w:val="26"/>
+              </w:rPr>
+              <w:br/>
+              <w:t>Bảng CSDL ai_task_logs ghi nhận đúng cờ _INTERNAL_LOCAL.</w:t>
+            </w:r>
+          </w:p>
+        </w:tc>
+      </w:tr>
     </w:tbl>
     <w:p>
       <w:pPr>
@@ -7130,13 +7343,13 @@
         <w:tblLook w:val="04A0" w:firstRow="1" w:lastRow="0" w:firstColumn="1" w:lastColumn="0" w:noHBand="0" w:noVBand="1"/>
       </w:tblPr>
       <w:tblGrid>
-        <w:gridCol w:w="1775"/>
-        <w:gridCol w:w="1110"/>
-        <w:gridCol w:w="740"/>
-        <w:gridCol w:w="968"/>
-        <w:gridCol w:w="1012"/>
-        <w:gridCol w:w="1644"/>
-        <w:gridCol w:w="1812"/>
+        <w:gridCol w:w="1637"/>
+        <w:gridCol w:w="972"/>
+        <w:gridCol w:w="659"/>
+        <w:gridCol w:w="852"/>
+        <w:gridCol w:w="890"/>
+        <w:gridCol w:w="2484"/>
+        <w:gridCol w:w="1567"/>
       </w:tblGrid>
       <w:tr>
         <w:tc>
@@ -7228,7 +7441,7 @@
         </w:tc>
         <w:tc>
           <w:tcPr>
-            <w:tcW w:w="1134" w:type="dxa"/>
+            <w:tcW w:w="1213" w:type="dxa"/>
             <w:hideMark/>
           </w:tcPr>
           <w:p>
@@ -7315,7 +7528,7 @@
         </w:tc>
         <w:tc>
           <w:tcPr>
-            <w:tcW w:w="2330" w:type="dxa"/>
+            <w:tcW w:w="2333" w:type="dxa"/>
             <w:hideMark/>
           </w:tcPr>
           <w:p>
@@ -7420,7 +7633,7 @@
         </w:tc>
         <w:tc>
           <w:tcPr>
-            <w:tcW w:w="1134" w:type="dxa"/>
+            <w:tcW w:w="1213" w:type="dxa"/>
             <w:hideMark/>
           </w:tcPr>
           <w:p>
@@ -7494,7 +7707,7 @@
         </w:tc>
         <w:tc>
           <w:tcPr>
-            <w:tcW w:w="2330" w:type="dxa"/>
+            <w:tcW w:w="2333" w:type="dxa"/>
             <w:hideMark/>
           </w:tcPr>
           <w:p>
@@ -7594,7 +7807,7 @@
         </w:tc>
         <w:tc>
           <w:tcPr>
-            <w:tcW w:w="1134" w:type="dxa"/>
+            <w:tcW w:w="1213" w:type="dxa"/>
             <w:hideMark/>
           </w:tcPr>
           <w:p>
@@ -7668,7 +7881,7 @@
         </w:tc>
         <w:tc>
           <w:tcPr>
-            <w:tcW w:w="2330" w:type="dxa"/>
+            <w:tcW w:w="2333" w:type="dxa"/>
             <w:hideMark/>
           </w:tcPr>
           <w:p>
@@ -7768,7 +7981,7 @@
         </w:tc>
         <w:tc>
           <w:tcPr>
-            <w:tcW w:w="1134" w:type="dxa"/>
+            <w:tcW w:w="1213" w:type="dxa"/>
             <w:hideMark/>
           </w:tcPr>
           <w:p>
@@ -7842,7 +8055,7 @@
         </w:tc>
         <w:tc>
           <w:tcPr>
-            <w:tcW w:w="2330" w:type="dxa"/>
+            <w:tcW w:w="2333" w:type="dxa"/>
             <w:hideMark/>
           </w:tcPr>
           <w:p>
@@ -7942,7 +8155,7 @@
         </w:tc>
         <w:tc>
           <w:tcPr>
-            <w:tcW w:w="1134" w:type="dxa"/>
+            <w:tcW w:w="1213" w:type="dxa"/>
             <w:hideMark/>
           </w:tcPr>
           <w:p>
@@ -8016,7 +8229,7 @@
         </w:tc>
         <w:tc>
           <w:tcPr>
-            <w:tcW w:w="2330" w:type="dxa"/>
+            <w:tcW w:w="2333" w:type="dxa"/>
             <w:hideMark/>
           </w:tcPr>
           <w:p>
@@ -8116,7 +8329,7 @@
         </w:tc>
         <w:tc>
           <w:tcPr>
-            <w:tcW w:w="1134" w:type="dxa"/>
+            <w:tcW w:w="1213" w:type="dxa"/>
             <w:hideMark/>
           </w:tcPr>
           <w:p>
@@ -8190,7 +8403,7 @@
         </w:tc>
         <w:tc>
           <w:tcPr>
-            <w:tcW w:w="2330" w:type="dxa"/>
+            <w:tcW w:w="2333" w:type="dxa"/>
             <w:hideMark/>
           </w:tcPr>
           <w:p>
@@ -8290,7 +8503,7 @@
         </w:tc>
         <w:tc>
           <w:tcPr>
-            <w:tcW w:w="1134" w:type="dxa"/>
+            <w:tcW w:w="1213" w:type="dxa"/>
             <w:hideMark/>
           </w:tcPr>
           <w:p>
@@ -8364,7 +8577,7 @@
         </w:tc>
         <w:tc>
           <w:tcPr>
-            <w:tcW w:w="2330" w:type="dxa"/>
+            <w:tcW w:w="2333" w:type="dxa"/>
             <w:hideMark/>
           </w:tcPr>
           <w:p>
@@ -8464,7 +8677,7 @@
         </w:tc>
         <w:tc>
           <w:tcPr>
-            <w:tcW w:w="1134" w:type="dxa"/>
+            <w:tcW w:w="1213" w:type="dxa"/>
             <w:hideMark/>
           </w:tcPr>
           <w:p>
@@ -8538,7 +8751,7 @@
         </w:tc>
         <w:tc>
           <w:tcPr>
-            <w:tcW w:w="2330" w:type="dxa"/>
+            <w:tcW w:w="2333" w:type="dxa"/>
             <w:hideMark/>
           </w:tcPr>
           <w:p>
@@ -8638,7 +8851,7 @@
         </w:tc>
         <w:tc>
           <w:tcPr>
-            <w:tcW w:w="1134" w:type="dxa"/>
+            <w:tcW w:w="1213" w:type="dxa"/>
             <w:hideMark/>
           </w:tcPr>
           <w:p>
@@ -8712,7 +8925,7 @@
         </w:tc>
         <w:tc>
           <w:tcPr>
-            <w:tcW w:w="2330" w:type="dxa"/>
+            <w:tcW w:w="2333" w:type="dxa"/>
             <w:hideMark/>
           </w:tcPr>
           <w:p>
@@ -8812,7 +9025,7 @@
         </w:tc>
         <w:tc>
           <w:tcPr>
-            <w:tcW w:w="1134" w:type="dxa"/>
+            <w:tcW w:w="1213" w:type="dxa"/>
             <w:hideMark/>
           </w:tcPr>
           <w:p>
@@ -8886,7 +9099,7 @@
         </w:tc>
         <w:tc>
           <w:tcPr>
-            <w:tcW w:w="2330" w:type="dxa"/>
+            <w:tcW w:w="2333" w:type="dxa"/>
             <w:hideMark/>
           </w:tcPr>
           <w:p>
@@ -8986,7 +9199,7 @@
         </w:tc>
         <w:tc>
           <w:tcPr>
-            <w:tcW w:w="1134" w:type="dxa"/>
+            <w:tcW w:w="1213" w:type="dxa"/>
             <w:hideMark/>
           </w:tcPr>
           <w:p>
@@ -9060,7 +9273,7 @@
         </w:tc>
         <w:tc>
           <w:tcPr>
-            <w:tcW w:w="2330" w:type="dxa"/>
+            <w:tcW w:w="2333" w:type="dxa"/>
             <w:hideMark/>
           </w:tcPr>
           <w:p>
@@ -9160,7 +9373,7 @@
         </w:tc>
         <w:tc>
           <w:tcPr>
-            <w:tcW w:w="1134" w:type="dxa"/>
+            <w:tcW w:w="1213" w:type="dxa"/>
             <w:hideMark/>
           </w:tcPr>
           <w:p>
@@ -9234,7 +9447,7 @@
         </w:tc>
         <w:tc>
           <w:tcPr>
-            <w:tcW w:w="2330" w:type="dxa"/>
+            <w:tcW w:w="2333" w:type="dxa"/>
             <w:hideMark/>
           </w:tcPr>
           <w:p>
@@ -9334,7 +9547,7 @@
         </w:tc>
         <w:tc>
           <w:tcPr>
-            <w:tcW w:w="1134" w:type="dxa"/>
+            <w:tcW w:w="1213" w:type="dxa"/>
             <w:hideMark/>
           </w:tcPr>
           <w:p>
@@ -9408,7 +9621,7 @@
         </w:tc>
         <w:tc>
           <w:tcPr>
-            <w:tcW w:w="2330" w:type="dxa"/>
+            <w:tcW w:w="2333" w:type="dxa"/>
             <w:hideMark/>
           </w:tcPr>
           <w:p>
@@ -9508,7 +9721,7 @@
         </w:tc>
         <w:tc>
           <w:tcPr>
-            <w:tcW w:w="1134" w:type="dxa"/>
+            <w:tcW w:w="1213" w:type="dxa"/>
             <w:hideMark/>
           </w:tcPr>
           <w:p>
@@ -9582,7 +9795,7 @@
         </w:tc>
         <w:tc>
           <w:tcPr>
-            <w:tcW w:w="2330" w:type="dxa"/>
+            <w:tcW w:w="2333" w:type="dxa"/>
             <w:hideMark/>
           </w:tcPr>
           <w:p>
@@ -9682,7 +9895,7 @@
         </w:tc>
         <w:tc>
           <w:tcPr>
-            <w:tcW w:w="1134" w:type="dxa"/>
+            <w:tcW w:w="1213" w:type="dxa"/>
             <w:hideMark/>
           </w:tcPr>
           <w:p>
@@ -9756,7 +9969,7 @@
         </w:tc>
         <w:tc>
           <w:tcPr>
-            <w:tcW w:w="2330" w:type="dxa"/>
+            <w:tcW w:w="2333" w:type="dxa"/>
             <w:hideMark/>
           </w:tcPr>
           <w:p>
@@ -9856,7 +10069,7 @@
         </w:tc>
         <w:tc>
           <w:tcPr>
-            <w:tcW w:w="1134" w:type="dxa"/>
+            <w:tcW w:w="1213" w:type="dxa"/>
             <w:hideMark/>
           </w:tcPr>
           <w:p>
@@ -9930,7 +10143,7 @@
         </w:tc>
         <w:tc>
           <w:tcPr>
-            <w:tcW w:w="2330" w:type="dxa"/>
+            <w:tcW w:w="2333" w:type="dxa"/>
             <w:hideMark/>
           </w:tcPr>
           <w:p>
@@ -10030,7 +10243,7 @@
         </w:tc>
         <w:tc>
           <w:tcPr>
-            <w:tcW w:w="1134" w:type="dxa"/>
+            <w:tcW w:w="1213" w:type="dxa"/>
             <w:hideMark/>
           </w:tcPr>
           <w:p>
@@ -10104,7 +10317,7 @@
         </w:tc>
         <w:tc>
           <w:tcPr>
-            <w:tcW w:w="2330" w:type="dxa"/>
+            <w:tcW w:w="2333" w:type="dxa"/>
             <w:hideMark/>
           </w:tcPr>
           <w:p>
@@ -10204,7 +10417,7 @@
         </w:tc>
         <w:tc>
           <w:tcPr>
-            <w:tcW w:w="1134" w:type="dxa"/>
+            <w:tcW w:w="1213" w:type="dxa"/>
             <w:hideMark/>
           </w:tcPr>
           <w:p>
@@ -10278,7 +10491,7 @@
         </w:tc>
         <w:tc>
           <w:tcPr>
-            <w:tcW w:w="2330" w:type="dxa"/>
+            <w:tcW w:w="2333" w:type="dxa"/>
             <w:hideMark/>
           </w:tcPr>
           <w:p>
@@ -10378,7 +10591,7 @@
         </w:tc>
         <w:tc>
           <w:tcPr>
-            <w:tcW w:w="1134" w:type="dxa"/>
+            <w:tcW w:w="1213" w:type="dxa"/>
             <w:hideMark/>
           </w:tcPr>
           <w:p>
@@ -10452,7 +10665,7 @@
         </w:tc>
         <w:tc>
           <w:tcPr>
-            <w:tcW w:w="2330" w:type="dxa"/>
+            <w:tcW w:w="2333" w:type="dxa"/>
             <w:hideMark/>
           </w:tcPr>
           <w:p>
@@ -10552,7 +10765,7 @@
         </w:tc>
         <w:tc>
           <w:tcPr>
-            <w:tcW w:w="1134" w:type="dxa"/>
+            <w:tcW w:w="1213" w:type="dxa"/>
             <w:hideMark/>
           </w:tcPr>
           <w:p>
@@ -10626,7 +10839,7 @@
         </w:tc>
         <w:tc>
           <w:tcPr>
-            <w:tcW w:w="2330" w:type="dxa"/>
+            <w:tcW w:w="2333" w:type="dxa"/>
             <w:hideMark/>
           </w:tcPr>
           <w:p>
@@ -10726,7 +10939,7 @@
         </w:tc>
         <w:tc>
           <w:tcPr>
-            <w:tcW w:w="1134" w:type="dxa"/>
+            <w:tcW w:w="1213" w:type="dxa"/>
             <w:hideMark/>
           </w:tcPr>
           <w:p>
@@ -10800,7 +11013,7 @@
         </w:tc>
         <w:tc>
           <w:tcPr>
-            <w:tcW w:w="2330" w:type="dxa"/>
+            <w:tcW w:w="2333" w:type="dxa"/>
             <w:hideMark/>
           </w:tcPr>
           <w:p>
@@ -10900,7 +11113,7 @@
         </w:tc>
         <w:tc>
           <w:tcPr>
-            <w:tcW w:w="1134" w:type="dxa"/>
+            <w:tcW w:w="1213" w:type="dxa"/>
             <w:hideMark/>
           </w:tcPr>
           <w:p>
@@ -10974,7 +11187,7 @@
         </w:tc>
         <w:tc>
           <w:tcPr>
-            <w:tcW w:w="2330" w:type="dxa"/>
+            <w:tcW w:w="2333" w:type="dxa"/>
             <w:hideMark/>
           </w:tcPr>
           <w:p>
@@ -11074,7 +11287,7 @@
         </w:tc>
         <w:tc>
           <w:tcPr>
-            <w:tcW w:w="1134" w:type="dxa"/>
+            <w:tcW w:w="1213" w:type="dxa"/>
             <w:hideMark/>
           </w:tcPr>
           <w:p>
@@ -11148,7 +11361,7 @@
         </w:tc>
         <w:tc>
           <w:tcPr>
-            <w:tcW w:w="2330" w:type="dxa"/>
+            <w:tcW w:w="2333" w:type="dxa"/>
             <w:hideMark/>
           </w:tcPr>
           <w:p>
@@ -11248,7 +11461,7 @@
         </w:tc>
         <w:tc>
           <w:tcPr>
-            <w:tcW w:w="1134" w:type="dxa"/>
+            <w:tcW w:w="1213" w:type="dxa"/>
             <w:hideMark/>
           </w:tcPr>
           <w:p>
@@ -11322,7 +11535,7 @@
         </w:tc>
         <w:tc>
           <w:tcPr>
-            <w:tcW w:w="2330" w:type="dxa"/>
+            <w:tcW w:w="2333" w:type="dxa"/>
             <w:hideMark/>
           </w:tcPr>
           <w:p>
@@ -11422,7 +11635,7 @@
         </w:tc>
         <w:tc>
           <w:tcPr>
-            <w:tcW w:w="1134" w:type="dxa"/>
+            <w:tcW w:w="1213" w:type="dxa"/>
             <w:hideMark/>
           </w:tcPr>
           <w:p>
@@ -11496,7 +11709,7 @@
         </w:tc>
         <w:tc>
           <w:tcPr>
-            <w:tcW w:w="2330" w:type="dxa"/>
+            <w:tcW w:w="2333" w:type="dxa"/>
             <w:hideMark/>
           </w:tcPr>
           <w:p>
@@ -11596,7 +11809,7 @@
         </w:tc>
         <w:tc>
           <w:tcPr>
-            <w:tcW w:w="1134" w:type="dxa"/>
+            <w:tcW w:w="1213" w:type="dxa"/>
             <w:hideMark/>
           </w:tcPr>
           <w:p>
@@ -11670,7 +11883,7 @@
         </w:tc>
         <w:tc>
           <w:tcPr>
-            <w:tcW w:w="2330" w:type="dxa"/>
+            <w:tcW w:w="2333" w:type="dxa"/>
             <w:hideMark/>
           </w:tcPr>
           <w:p>
@@ -11770,7 +11983,7 @@
         </w:tc>
         <w:tc>
           <w:tcPr>
-            <w:tcW w:w="1134" w:type="dxa"/>
+            <w:tcW w:w="1213" w:type="dxa"/>
             <w:hideMark/>
           </w:tcPr>
           <w:p>
@@ -11854,7 +12067,7 @@
         </w:tc>
         <w:tc>
           <w:tcPr>
-            <w:tcW w:w="2330" w:type="dxa"/>
+            <w:tcW w:w="2333" w:type="dxa"/>
             <w:hideMark/>
           </w:tcPr>
           <w:p>
@@ -11954,7 +12167,7 @@
         </w:tc>
         <w:tc>
           <w:tcPr>
-            <w:tcW w:w="1134" w:type="dxa"/>
+            <w:tcW w:w="1213" w:type="dxa"/>
             <w:hideMark/>
           </w:tcPr>
           <w:p>
@@ -12028,7 +12241,7 @@
         </w:tc>
         <w:tc>
           <w:tcPr>
-            <w:tcW w:w="2330" w:type="dxa"/>
+            <w:tcW w:w="2333" w:type="dxa"/>
             <w:hideMark/>
           </w:tcPr>
           <w:p>
@@ -12128,7 +12341,7 @@
         </w:tc>
         <w:tc>
           <w:tcPr>
-            <w:tcW w:w="1134" w:type="dxa"/>
+            <w:tcW w:w="1213" w:type="dxa"/>
             <w:hideMark/>
           </w:tcPr>
           <w:p>
@@ -12202,7 +12415,7 @@
         </w:tc>
         <w:tc>
           <w:tcPr>
-            <w:tcW w:w="2330" w:type="dxa"/>
+            <w:tcW w:w="2333" w:type="dxa"/>
             <w:hideMark/>
           </w:tcPr>
           <w:p>
@@ -12221,6 +12434,219 @@
                 <w:szCs w:val="26"/>
               </w:rPr>
               <w:t>Kiểm thử tính sẵn sàng &amp; chịu lỗi</w:t>
+            </w:r>
+          </w:p>
+        </w:tc>
+      </w:tr>
+      <w:tr>
+        <w:tc>
+          <w:tcPr>
+            <w:tcW w:w="0" w:type="auto"/>
+          </w:tcPr>
+          <w:p>
+            <w:pPr>
+              <w:spacing w:after="0" w:line="360" w:lineRule="auto"/>
+              <w:rPr>
+                <w:rFonts w:ascii="Times New Roman" w:hAnsi="Times New Roman" w:cs="Times New Roman"/>
+                <w:b/>
+                <w:bCs/>
+                <w:sz w:val="26"/>
+                <w:szCs w:val="26"/>
+              </w:rPr>
+            </w:pPr>
+            <w:r>
+              <w:rPr>
+                <w:rFonts w:ascii="Times New Roman" w:hAnsi="Times New Roman" w:cs="Times New Roman"/>
+                <w:b/>
+                <w:bCs/>
+                <w:sz w:val="26"/>
+                <w:szCs w:val="26"/>
+              </w:rPr>
+              <w:t>TC_AI_LOCAL_01</w:t>
+            </w:r>
+          </w:p>
+        </w:tc>
+        <w:tc>
+          <w:tcPr>
+            <w:tcW w:w="0" w:type="auto"/>
+          </w:tcPr>
+          <w:p>
+            <w:pPr>
+              <w:spacing w:after="0" w:line="360" w:lineRule="auto"/>
+              <w:rPr>
+                <w:rFonts w:ascii="Times New Roman" w:hAnsi="Times New Roman" w:cs="Times New Roman"/>
+                <w:sz w:val="26"/>
+                <w:szCs w:val="26"/>
+              </w:rPr>
+            </w:pPr>
+            <w:r>
+              <w:rPr>
+                <w:rFonts w:ascii="Times New Roman" w:hAnsi="Times New Roman" w:cs="Times New Roman"/>
+                <w:sz w:val="26"/>
+                <w:szCs w:val="26"/>
+              </w:rPr>
+              <w:t>24/09/2026</w:t>
+            </w:r>
+          </w:p>
+        </w:tc>
+        <w:tc>
+          <w:tcPr>
+            <w:tcW w:w="2207" w:type="dxa"/>
+          </w:tcPr>
+          <w:p>
+            <w:pPr>
+              <w:spacing w:after="0" w:line="360" w:lineRule="auto"/>
+              <w:rPr>
+                <w:rFonts w:ascii="Times New Roman" w:hAnsi="Times New Roman" w:cs="Times New Roman"/>
+                <w:sz w:val="26"/>
+                <w:szCs w:val="26"/>
+              </w:rPr>
+            </w:pPr>
+            <w:r>
+              <w:rPr>
+                <w:rFonts w:ascii="Times New Roman" w:hAnsi="Times New Roman" w:cs="Times New Roman"/>
+                <w:sz w:val="26"/>
+                <w:szCs w:val="26"/>
+              </w:rPr>
+              <w:t>Hoàng Anh Tuấn</w:t>
+            </w:r>
+          </w:p>
+        </w:tc>
+        <w:tc>
+          <w:tcPr>
+            <w:tcW w:w="1213" w:type="dxa"/>
+          </w:tcPr>
+          <w:p>
+            <w:pPr>
+              <w:spacing w:after="0" w:line="360" w:lineRule="auto"/>
+              <w:rPr>
+                <w:rFonts w:ascii="Times New Roman" w:hAnsi="Times New Roman" w:cs="Times New Roman"/>
+                <w:b/>
+                <w:bCs/>
+                <w:sz w:val="26"/>
+                <w:szCs w:val="26"/>
+              </w:rPr>
+            </w:pPr>
+            <w:r>
+              <w:rPr>
+                <w:rFonts w:ascii="Times New Roman" w:hAnsi="Times New Roman" w:cs="Times New Roman"/>
+                <w:b/>
+                <w:bCs/>
+                <w:sz w:val="26"/>
+                <w:szCs w:val="26"/>
+              </w:rPr>
+              <w:t>PASS</w:t>
+            </w:r>
+          </w:p>
+        </w:tc>
+        <w:tc>
+          <w:tcPr>
+            <w:tcW w:w="2693" w:type="dxa"/>
+          </w:tcPr>
+          <w:p>
+            <w:pPr>
+              <w:spacing w:after="0" w:line="360" w:lineRule="auto"/>
+              <w:rPr>
+                <w:rFonts w:ascii="Times New Roman" w:hAnsi="Times New Roman" w:cs="Times New Roman"/>
+                <w:sz w:val="26"/>
+                <w:szCs w:val="26"/>
+              </w:rPr>
+            </w:pPr>
+            <w:r>
+              <w:rPr>
+                <w:rFonts w:ascii="Times New Roman" w:hAnsi="Times New Roman" w:cs="Times New Roman"/>
+                <w:sz w:val="26"/>
+                <w:szCs w:val="26"/>
+              </w:rPr>
+              <w:t>Nghiêm trọng (Critical)</w:t>
+            </w:r>
+          </w:p>
+        </w:tc>
+        <w:tc>
+          <w:tcPr>
+            <w:tcW w:w="4515" w:type="dxa"/>
+          </w:tcPr>
+          <w:p>
+            <w:pPr>
+              <w:spacing w:after="0" w:line="360" w:lineRule="auto"/>
+              <w:rPr>
+                <w:rFonts w:ascii="Times New Roman" w:hAnsi="Times New Roman" w:cs="Times New Roman"/>
+                <w:sz w:val="26"/>
+                <w:szCs w:val="26"/>
+              </w:rPr>
+            </w:pPr>
+            <w:r>
+              <w:rPr>
+                <w:rFonts w:ascii="Times New Roman" w:hAnsi="Times New Roman" w:cs="Times New Roman"/>
+                <w:sz w:val="26"/>
+                <w:szCs w:val="26"/>
+              </w:rPr>
+              <w:t>Không có lỗi. Hệ thống tự động kích hoạt chế độ AI Cục bộ on-premise và lưu vết kiểm</w:t>
+            </w:r>
+            <w:r>
+              <w:rPr>
+                <w:rFonts w:ascii="Times New Roman" w:hAnsi="Times New Roman" w:cs="Times New Roman"/>
+                <w:sz w:val="26"/>
+                <w:szCs w:val="26"/>
+              </w:rPr>
+              <w:t xml:space="preserve"> </w:t>
+            </w:r>
+            <w:r>
+              <w:rPr>
+                <w:rFonts w:ascii="Times New Roman" w:hAnsi="Times New Roman" w:cs="Times New Roman"/>
+                <w:sz w:val="26"/>
+                <w:szCs w:val="26"/>
+              </w:rPr>
+              <w:t>toán _INTERNAL_LOCAL trong CSDL.</w:t>
+            </w:r>
+          </w:p>
+        </w:tc>
+        <w:tc>
+          <w:tcPr>
+            <w:tcW w:w="2333" w:type="dxa"/>
+          </w:tcPr>
+          <w:p>
+            <w:pPr>
+              <w:spacing w:after="0" w:line="360" w:lineRule="auto"/>
+              <w:rPr>
+                <w:rFonts w:ascii="Times New Roman" w:hAnsi="Times New Roman" w:cs="Times New Roman"/>
+                <w:sz w:val="26"/>
+                <w:szCs w:val="26"/>
+              </w:rPr>
+            </w:pPr>
+            <w:r>
+              <w:rPr>
+                <w:rFonts w:ascii="Times New Roman" w:hAnsi="Times New Roman" w:cs="Times New Roman"/>
+                <w:sz w:val="26"/>
+                <w:szCs w:val="26"/>
+              </w:rPr>
+              <w:t>Python</w:t>
+            </w:r>
+            <w:r>
+              <w:rPr>
+                <w:rFonts w:ascii="Times New Roman" w:hAnsi="Times New Roman" w:cs="Times New Roman"/>
+                <w:sz w:val="26"/>
+                <w:szCs w:val="26"/>
+              </w:rPr>
+              <w:t xml:space="preserve"> tự động</w:t>
+            </w:r>
+          </w:p>
+          <w:p>
+            <w:pPr>
+              <w:spacing w:after="0" w:line="360" w:lineRule="auto"/>
+              <w:rPr>
+                <w:rFonts w:ascii="Times New Roman" w:hAnsi="Times New Roman" w:cs="Times New Roman"/>
+                <w:sz w:val="26"/>
+                <w:szCs w:val="26"/>
+              </w:rPr>
+            </w:pPr>
+            <w:r>
+              <w:rPr>
+                <w:rFonts w:ascii="Times New Roman" w:hAnsi="Times New Roman" w:cs="Times New Roman"/>
+                <w:sz w:val="26"/>
+                <w:szCs w:val="26"/>
+              </w:rPr>
+              <w:t>(test_ai.py) kết hợp kiểm thử giao diện</w:t>
             </w:r>
           </w:p>
         </w:tc>
@@ -13613,7 +14039,6 @@
   <w:style w:type="character" w:default="1" w:styleId="DefaultParagraphFont">
     <w:name w:val="Default Paragraph Font"/>
     <w:uiPriority w:val="1"/>
-    <w:semiHidden/>
     <w:unhideWhenUsed/>
   </w:style>
   <w:style w:type="table" w:default="1" w:styleId="TableNormal">

</xml_diff>